<commit_message>
Rename branding and UI text to Infra-Mapper
</commit_message>
<xml_diff>
--- a/InfraMapper_User_Guide.docx
+++ b/InfraMapper_User_Guide.docx
@@ -18,9 +18,7 @@
           <w:color w:val="06B6D4"/>
           <w:sz w:val="72"/>
         </w:rPr>
-        <w:t>InfraMapper</w:t>
-        <w:br/>
-        <w:t>&amp; Nmap Studio</w:t>
+        <w:t>Infra-Mapper</w:t>
       </w:r>
     </w:p>
     <w:p>
@@ -488,7 +486,7 @@
     </w:p>
     <w:p>
       <w:r>
-        <w:t>This guide explains how to install, configure, and use InfraMapper, an infrastructure-based network discovery and asset mapping suite integrated into Nmap Studio. It is designed for network administrators, penetration testers, security engineers, and IT operations teams.</w:t>
+        <w:t>This guide explains how to install, configure, and use Infra-Mapper, an infrastructure-based network discovery and asset mapping suite. It is designed for network administrators, penetration testers, security engineers, and IT operations teams.</w:t>
       </w:r>
     </w:p>
     <w:p>
@@ -496,12 +494,12 @@
         <w:pStyle w:val="Heading2"/>
       </w:pPr>
       <w:r>
-        <w:t>1.2 What is InfraMapper?</w:t>
+        <w:t>1.2 What is Infra-Mapper?</w:t>
       </w:r>
     </w:p>
     <w:p>
       <w:r>
-        <w:t>InfraMapper is an infrastructure-based scanner that discovers live hosts, open ports, running services, and operating systems across IP ranges and subnets. It maps your network infrastructure and produces structured asset inventories. Unlike heavy application-layer fuzzers, InfraMapper focuses on network visibility, attack surface reduction, and asset inventory validation.</w:t>
+        <w:t>Infra-Mapper is an infrastructure-based scanner that discovers live hosts, open ports, running services, and operating systems across IP ranges and subnets. It maps your network infrastructure and produces structured asset inventories. Unlike heavy application-layer fuzzers, Infra-Mapper focuses on network visibility, attack surface reduction, and asset inventory validation.</w:t>
       </w:r>
     </w:p>
     <w:p>

</xml_diff>